<commit_message>
feat(resources): update Claude Connector questions file
- Update document content for "Claude_Connector_Supplier_Quotes_Questions.docx"
- Adjust file metadata and size metrics
- Register new download event in analytics log
</commit_message>
<xml_diff>
--- a/public/_internal_workshop_assets/Claude_Connector_Supplier_Quotes_Questions.docx
+++ b/public/_internal_workshop_assets/Claude_Connector_Supplier_Quotes_Questions.docx
@@ -63,12 +63,6 @@
         <w:gridCol w:w="3626"/>
       </w:tblGrid>
       <w:tr>
-        <w:tblPrEx>
-          <w:tblCellMar>
-            <w:top w:w="0" w:type="dxa"/>
-            <w:bottom w:w="0" w:type="dxa"/>
-          </w:tblCellMar>
-        </w:tblPrEx>
         <w:trPr>
           <w:tblHeader/>
         </w:trPr>
@@ -140,12 +134,6 @@
         </w:tc>
       </w:tr>
       <w:tr>
-        <w:tblPrEx>
-          <w:tblCellMar>
-            <w:top w:w="0" w:type="dxa"/>
-            <w:bottom w:w="0" w:type="dxa"/>
-          </w:tblCellMar>
-        </w:tblPrEx>
         <w:tc>
           <w:tcPr>
             <w:tcW w:w="2000" w:type="dxa"/>
@@ -198,12 +186,6 @@
         </w:tc>
       </w:tr>
       <w:tr>
-        <w:tblPrEx>
-          <w:tblCellMar>
-            <w:top w:w="0" w:type="dxa"/>
-            <w:bottom w:w="0" w:type="dxa"/>
-          </w:tblCellMar>
-        </w:tblPrEx>
         <w:tc>
           <w:tcPr>
             <w:tcW w:w="2000" w:type="dxa"/>
@@ -254,12 +236,6 @@
         </w:tc>
       </w:tr>
       <w:tr>
-        <w:tblPrEx>
-          <w:tblCellMar>
-            <w:top w:w="0" w:type="dxa"/>
-            <w:bottom w:w="0" w:type="dxa"/>
-          </w:tblCellMar>
-        </w:tblPrEx>
         <w:tc>
           <w:tcPr>
             <w:tcW w:w="2000" w:type="dxa"/>
@@ -310,12 +286,6 @@
         </w:tc>
       </w:tr>
       <w:tr>
-        <w:tblPrEx>
-          <w:tblCellMar>
-            <w:top w:w="0" w:type="dxa"/>
-            <w:bottom w:w="0" w:type="dxa"/>
-          </w:tblCellMar>
-        </w:tblPrEx>
         <w:tc>
           <w:tcPr>
             <w:tcW w:w="2000" w:type="dxa"/>
@@ -464,12 +434,6 @@
         <w:gridCol w:w="9026"/>
       </w:tblGrid>
       <w:tr>
-        <w:tblPrEx>
-          <w:tblCellMar>
-            <w:top w:w="0" w:type="dxa"/>
-            <w:bottom w:w="0" w:type="dxa"/>
-          </w:tblCellMar>
-        </w:tblPrEx>
         <w:tc>
           <w:tcPr>
             <w:tcW w:w="9026" w:type="dxa"/>
@@ -613,12 +577,6 @@
         <w:gridCol w:w="9026"/>
       </w:tblGrid>
       <w:tr>
-        <w:tblPrEx>
-          <w:tblCellMar>
-            <w:top w:w="0" w:type="dxa"/>
-            <w:bottom w:w="0" w:type="dxa"/>
-          </w:tblCellMar>
-        </w:tblPrEx>
         <w:tc>
           <w:tcPr>
             <w:tcW w:w="9026" w:type="dxa"/>
@@ -763,12 +721,6 @@
         <w:gridCol w:w="9026"/>
       </w:tblGrid>
       <w:tr>
-        <w:tblPrEx>
-          <w:tblCellMar>
-            <w:top w:w="0" w:type="dxa"/>
-            <w:bottom w:w="0" w:type="dxa"/>
-          </w:tblCellMar>
-        </w:tblPrEx>
         <w:tc>
           <w:tcPr>
             <w:tcW w:w="9026" w:type="dxa"/>
@@ -928,12 +880,6 @@
         <w:gridCol w:w="9026"/>
       </w:tblGrid>
       <w:tr>
-        <w:tblPrEx>
-          <w:tblCellMar>
-            <w:top w:w="0" w:type="dxa"/>
-            <w:bottom w:w="0" w:type="dxa"/>
-          </w:tblCellMar>
-        </w:tblPrEx>
         <w:tc>
           <w:tcPr>
             <w:tcW w:w="9026" w:type="dxa"/>
@@ -1134,12 +1080,6 @@
         <w:gridCol w:w="9026"/>
       </w:tblGrid>
       <w:tr>
-        <w:tblPrEx>
-          <w:tblCellMar>
-            <w:top w:w="0" w:type="dxa"/>
-            <w:bottom w:w="0" w:type="dxa"/>
-          </w:tblCellMar>
-        </w:tblPrEx>
         <w:tc>
           <w:tcPr>
             <w:tcW w:w="9026" w:type="dxa"/>
@@ -1405,41 +1345,49 @@
       </w:pPr>
     </w:lvl>
     <w:lvl w:ilvl="1" w:tplc="6FF45424">
+      <w:start w:val="1"/>
       <w:numFmt w:val="decimal"/>
       <w:lvlText w:val=""/>
       <w:lvlJc w:val="left"/>
     </w:lvl>
     <w:lvl w:ilvl="2" w:tplc="5604426E">
+      <w:start w:val="1"/>
       <w:numFmt w:val="decimal"/>
       <w:lvlText w:val=""/>
       <w:lvlJc w:val="left"/>
     </w:lvl>
     <w:lvl w:ilvl="3" w:tplc="F20A0966">
+      <w:start w:val="1"/>
       <w:numFmt w:val="decimal"/>
       <w:lvlText w:val=""/>
       <w:lvlJc w:val="left"/>
     </w:lvl>
     <w:lvl w:ilvl="4" w:tplc="EA30CCF8">
+      <w:start w:val="1"/>
       <w:numFmt w:val="decimal"/>
       <w:lvlText w:val=""/>
       <w:lvlJc w:val="left"/>
     </w:lvl>
     <w:lvl w:ilvl="5" w:tplc="00FCFA52">
+      <w:start w:val="1"/>
       <w:numFmt w:val="decimal"/>
       <w:lvlText w:val=""/>
       <w:lvlJc w:val="left"/>
     </w:lvl>
     <w:lvl w:ilvl="6" w:tplc="E0362884">
+      <w:start w:val="1"/>
       <w:numFmt w:val="decimal"/>
       <w:lvlText w:val=""/>
       <w:lvlJc w:val="left"/>
     </w:lvl>
     <w:lvl w:ilvl="7" w:tplc="9490E236">
+      <w:start w:val="1"/>
       <w:numFmt w:val="decimal"/>
       <w:lvlText w:val=""/>
       <w:lvlJc w:val="left"/>
     </w:lvl>
     <w:lvl w:ilvl="8" w:tplc="B89CB33A">
+      <w:start w:val="1"/>
       <w:numFmt w:val="decimal"/>
       <w:lvlText w:val=""/>
       <w:lvlJc w:val="left"/>

</xml_diff>